<commit_message>
Add the final report for the supervisor and the team
A short report in bullet points: what was changed and edited, what was
added that was not in the team's Word documents (including the material
from Shaikha's notes), a table of the reference checks, and, in red, the
points to verify before publication. The report builder now supports
italics and red lists.

Co-Authored-By: Claude Opus 5.5 <noreply@anthropic.com>
Claude-Session: https://claude.ai/code/session_01VkNWz9zCVkDAANuF8jpQYy
</commit_message>
<xml_diff>
--- a/Handbook-Correction-Log.docx
+++ b/Handbook-Correction-Log.docx
@@ -5480,7 +5480,25 @@
                 <w:sz w:val="19"/>
                 <w:szCs w:val="19"/>
               </w:rPr>
-              <w:t xml:space="preserve">The explanation is wrong: _heavy_ becomes the adverbial phrase </w:t>
+              <w:t xml:space="preserve">The explanation is wrong: </w:t>
+            </w:r>
+            <w:r>
+              <w:rPr>
+                <w:rFonts w:ascii="Arial" w:cs="Arial" w:eastAsia="Arial" w:hAnsi="Arial"/>
+                <w:i/>
+                <w:iCs/>
+                <w:sz w:val="19"/>
+                <w:szCs w:val="19"/>
+              </w:rPr>
+              <w:t xml:space="preserve">heavy</w:t>
+            </w:r>
+            <w:r>
+              <w:rPr>
+                <w:rFonts w:ascii="Arial" w:cs="Arial" w:eastAsia="Arial" w:hAnsi="Arial"/>
+                <w:sz w:val="19"/>
+                <w:szCs w:val="19"/>
+              </w:rPr>
+              <w:t xml:space="preserve"> becomes the adverbial phrase </w:t>
             </w:r>
             <w:r>
               <w:rPr>
@@ -5497,7 +5515,25 @@
                 <w:sz w:val="19"/>
                 <w:szCs w:val="19"/>
               </w:rPr>
-              <w:t xml:space="preserve">; it is _smoker_ that becomes a verb.</w:t>
+              <w:t xml:space="preserve">; it is </w:t>
+            </w:r>
+            <w:r>
+              <w:rPr>
+                <w:rFonts w:ascii="Arial" w:cs="Arial" w:eastAsia="Arial" w:hAnsi="Arial"/>
+                <w:i/>
+                <w:iCs/>
+                <w:sz w:val="19"/>
+                <w:szCs w:val="19"/>
+              </w:rPr>
+              <w:t xml:space="preserve">smoker</w:t>
+            </w:r>
+            <w:r>
+              <w:rPr>
+                <w:rFonts w:ascii="Arial" w:cs="Arial" w:eastAsia="Arial" w:hAnsi="Arial"/>
+                <w:sz w:val="19"/>
+                <w:szCs w:val="19"/>
+              </w:rPr>
+              <w:t xml:space="preserve"> that becomes a verb.</w:t>
             </w:r>
           </w:p>
         </w:tc>
@@ -6758,7 +6794,25 @@
                 <w:sz w:val="19"/>
                 <w:szCs w:val="19"/>
               </w:rPr>
-              <w:t xml:space="preserve">The list labels only some examples as related or unrelated, so beginners cannot tell which category _case_ illustrates.</w:t>
+              <w:t xml:space="preserve">The list labels only some examples as related or unrelated, so beginners cannot tell which category </w:t>
+            </w:r>
+            <w:r>
+              <w:rPr>
+                <w:rFonts w:ascii="Arial" w:cs="Arial" w:eastAsia="Arial" w:hAnsi="Arial"/>
+                <w:i/>
+                <w:iCs/>
+                <w:sz w:val="19"/>
+                <w:szCs w:val="19"/>
+              </w:rPr>
+              <w:t xml:space="preserve">case</w:t>
+            </w:r>
+            <w:r>
+              <w:rPr>
+                <w:rFonts w:ascii="Arial" w:cs="Arial" w:eastAsia="Arial" w:hAnsi="Arial"/>
+                <w:sz w:val="19"/>
+                <w:szCs w:val="19"/>
+              </w:rPr>
+              <w:t xml:space="preserve"> illustrates.</w:t>
             </w:r>
           </w:p>
         </w:tc>
@@ -7168,7 +7222,25 @@
                 <w:sz w:val="19"/>
                 <w:szCs w:val="19"/>
               </w:rPr>
-              <w:t xml:space="preserve">An absolute ban contradicts Chapter 10, where the collocation _to play a role_ → </w:t>
+              <w:t xml:space="preserve">An absolute ban contradicts Chapter 10, where the collocation </w:t>
+            </w:r>
+            <w:r>
+              <w:rPr>
+                <w:rFonts w:ascii="Arial" w:cs="Arial" w:eastAsia="Arial" w:hAnsi="Arial"/>
+                <w:i/>
+                <w:iCs/>
+                <w:sz w:val="19"/>
+                <w:szCs w:val="19"/>
+              </w:rPr>
+              <w:t xml:space="preserve">to play a role</w:t>
+            </w:r>
+            <w:r>
+              <w:rPr>
+                <w:rFonts w:ascii="Arial" w:cs="Arial" w:eastAsia="Arial" w:hAnsi="Arial"/>
+                <w:sz w:val="19"/>
+                <w:szCs w:val="19"/>
+              </w:rPr>
+              <w:t xml:space="preserve"> → </w:t>
             </w:r>
             <w:r>
               <w:rPr>
@@ -7560,7 +7632,25 @@
                 <w:sz w:val="19"/>
                 <w:szCs w:val="19"/>
               </w:rPr>
-              <w:t xml:space="preserve">'Never' contradicts Chapter 9 (_think outside the box_ kept formally) and Chapter 11 (shared images translated literally); the Answer key's 'never' in c2b.js needs the same softening.</w:t>
+              <w:t xml:space="preserve">'Never' contradicts Chapter 9 (</w:t>
+            </w:r>
+            <w:r>
+              <w:rPr>
+                <w:rFonts w:ascii="Arial" w:cs="Arial" w:eastAsia="Arial" w:hAnsi="Arial"/>
+                <w:i/>
+                <w:iCs/>
+                <w:sz w:val="19"/>
+                <w:szCs w:val="19"/>
+              </w:rPr>
+              <w:t xml:space="preserve">think outside the box</w:t>
+            </w:r>
+            <w:r>
+              <w:rPr>
+                <w:rFonts w:ascii="Arial" w:cs="Arial" w:eastAsia="Arial" w:hAnsi="Arial"/>
+                <w:sz w:val="19"/>
+                <w:szCs w:val="19"/>
+              </w:rPr>
+              <w:t xml:space="preserve"> kept formally) and Chapter 11 (shared images translated literally); the Answer key's 'never' in c2b.js needs the same softening.</w:t>
             </w:r>
           </w:p>
         </w:tc>
@@ -7970,7 +8060,25 @@
                 <w:sz w:val="19"/>
                 <w:szCs w:val="19"/>
               </w:rPr>
-              <w:t xml:space="preserve">By the chapter's own definitions a plain non-idiomatic rendering is ideational, not functional; the Arabic also dropped the modal _should_.</w:t>
+              <w:t xml:space="preserve">By the chapter's own definitions a plain non-idiomatic rendering is ideational, not functional; the Arabic also dropped the modal </w:t>
+            </w:r>
+            <w:r>
+              <w:rPr>
+                <w:rFonts w:ascii="Arial" w:cs="Arial" w:eastAsia="Arial" w:hAnsi="Arial"/>
+                <w:i/>
+                <w:iCs/>
+                <w:sz w:val="19"/>
+                <w:szCs w:val="19"/>
+              </w:rPr>
+              <w:t xml:space="preserve">should</w:t>
+            </w:r>
+            <w:r>
+              <w:rPr>
+                <w:rFonts w:ascii="Arial" w:cs="Arial" w:eastAsia="Arial" w:hAnsi="Arial"/>
+                <w:sz w:val="19"/>
+                <w:szCs w:val="19"/>
+              </w:rPr>
+              <w:t xml:space="preserve">.</w:t>
             </w:r>
           </w:p>
         </w:tc>
@@ -8104,7 +8212,25 @@
                 <w:sz w:val="19"/>
                 <w:szCs w:val="19"/>
               </w:rPr>
-              <w:t xml:space="preserve"> ('distinguished') loses the superlative meaning of _second to none_, so the ideational version changes the idea instead of keeping it.</w:t>
+              <w:t xml:space="preserve"> ('distinguished') loses the superlative meaning of </w:t>
+            </w:r>
+            <w:r>
+              <w:rPr>
+                <w:rFonts w:ascii="Arial" w:cs="Arial" w:eastAsia="Arial" w:hAnsi="Arial"/>
+                <w:i/>
+                <w:iCs/>
+                <w:sz w:val="19"/>
+                <w:szCs w:val="19"/>
+              </w:rPr>
+              <w:t xml:space="preserve">second to none</w:t>
+            </w:r>
+            <w:r>
+              <w:rPr>
+                <w:rFonts w:ascii="Arial" w:cs="Arial" w:eastAsia="Arial" w:hAnsi="Arial"/>
+                <w:sz w:val="19"/>
+                <w:szCs w:val="19"/>
+              </w:rPr>
+              <w:t xml:space="preserve">, so the ideational version changes the idea instead of keeping it.</w:t>
             </w:r>
           </w:p>
         </w:tc>
@@ -8510,10 +8636,20 @@
             <w:r>
               <w:rPr>
                 <w:rFonts w:ascii="Arial" w:cs="Arial" w:eastAsia="Arial" w:hAnsi="Arial"/>
-                <w:sz w:val="19"/>
-                <w:szCs w:val="19"/>
-              </w:rPr>
-              <w:t xml:space="preserve">_Adaptation_ is a key term of this chapter but is never mentioned in the text.</w:t>
+                <w:i/>
+                <w:iCs/>
+                <w:sz w:val="19"/>
+                <w:szCs w:val="19"/>
+              </w:rPr>
+              <w:t xml:space="preserve">Adaptation</w:t>
+            </w:r>
+            <w:r>
+              <w:rPr>
+                <w:rFonts w:ascii="Arial" w:cs="Arial" w:eastAsia="Arial" w:hAnsi="Arial"/>
+                <w:sz w:val="19"/>
+                <w:szCs w:val="19"/>
+              </w:rPr>
+              <w:t xml:space="preserve"> is a key term of this chapter but is never mentioned in the text.</w:t>
             </w:r>
           </w:p>
         </w:tc>
@@ -9170,10 +9306,20 @@
             <w:r>
               <w:rPr>
                 <w:rFonts w:ascii="Arial" w:cs="Arial" w:eastAsia="Arial" w:hAnsi="Arial"/>
-                <w:sz w:val="19"/>
-                <w:szCs w:val="19"/>
-              </w:rPr>
-              <w:t xml:space="preserve">_She is a moon_ is not natural English, and in Arabic balāgha </w:t>
+                <w:i/>
+                <w:iCs/>
+                <w:sz w:val="19"/>
+                <w:szCs w:val="19"/>
+              </w:rPr>
+              <w:t xml:space="preserve">She is a moon</w:t>
+            </w:r>
+            <w:r>
+              <w:rPr>
+                <w:rFonts w:ascii="Arial" w:cs="Arial" w:eastAsia="Arial" w:hAnsi="Arial"/>
+                <w:sz w:val="19"/>
+                <w:szCs w:val="19"/>
+              </w:rPr>
+              <w:t xml:space="preserve"> is not natural English, and in Arabic balāgha </w:t>
             </w:r>
             <w:r>
               <w:rPr>
@@ -9491,7 +9637,43 @@
                 <w:sz w:val="19"/>
                 <w:szCs w:val="19"/>
               </w:rPr>
-              <w:t xml:space="preserve">In English _see the light_ means 'to understand or be converted'; 'be published' is _see the light of day_, so the example of a shared metaphor is an Arabism. </w:t>
+              <w:t xml:space="preserve">In English </w:t>
+            </w:r>
+            <w:r>
+              <w:rPr>
+                <w:rFonts w:ascii="Arial" w:cs="Arial" w:eastAsia="Arial" w:hAnsi="Arial"/>
+                <w:i/>
+                <w:iCs/>
+                <w:sz w:val="19"/>
+                <w:szCs w:val="19"/>
+              </w:rPr>
+              <w:t xml:space="preserve">see the light</w:t>
+            </w:r>
+            <w:r>
+              <w:rPr>
+                <w:rFonts w:ascii="Arial" w:cs="Arial" w:eastAsia="Arial" w:hAnsi="Arial"/>
+                <w:sz w:val="19"/>
+                <w:szCs w:val="19"/>
+              </w:rPr>
+              <w:t xml:space="preserve"> means 'to understand or be converted'; 'be published' is </w:t>
+            </w:r>
+            <w:r>
+              <w:rPr>
+                <w:rFonts w:ascii="Arial" w:cs="Arial" w:eastAsia="Arial" w:hAnsi="Arial"/>
+                <w:i/>
+                <w:iCs/>
+                <w:sz w:val="19"/>
+                <w:szCs w:val="19"/>
+              </w:rPr>
+              <w:t xml:space="preserve">see the light of day</w:t>
+            </w:r>
+            <w:r>
+              <w:rPr>
+                <w:rFonts w:ascii="Arial" w:cs="Arial" w:eastAsia="Arial" w:hAnsi="Arial"/>
+                <w:sz w:val="19"/>
+                <w:szCs w:val="19"/>
+              </w:rPr>
+              <w:t xml:space="preserve">, so the example of a shared metaphor is an Arabism. </w:t>
             </w:r>
             <w:r>
               <w:rPr>
@@ -9630,10 +9812,38 @@
             <w:r>
               <w:rPr>
                 <w:rFonts w:ascii="Arial" w:cs="Arial" w:eastAsia="Arial" w:hAnsi="Arial"/>
-                <w:sz w:val="19"/>
-                <w:szCs w:val="19"/>
-              </w:rPr>
-              <w:t xml:space="preserve">_My thoughts evaporated_ is not a usual English collocation; _hopes evaporated_ is natural in both languages.</w:t>
+                <w:i/>
+                <w:iCs/>
+                <w:sz w:val="19"/>
+                <w:szCs w:val="19"/>
+              </w:rPr>
+              <w:t xml:space="preserve">My thoughts evaporated</w:t>
+            </w:r>
+            <w:r>
+              <w:rPr>
+                <w:rFonts w:ascii="Arial" w:cs="Arial" w:eastAsia="Arial" w:hAnsi="Arial"/>
+                <w:sz w:val="19"/>
+                <w:szCs w:val="19"/>
+              </w:rPr>
+              <w:t xml:space="preserve"> is not a usual English collocation; </w:t>
+            </w:r>
+            <w:r>
+              <w:rPr>
+                <w:rFonts w:ascii="Arial" w:cs="Arial" w:eastAsia="Arial" w:hAnsi="Arial"/>
+                <w:i/>
+                <w:iCs/>
+                <w:sz w:val="19"/>
+                <w:szCs w:val="19"/>
+              </w:rPr>
+              <w:t xml:space="preserve">hopes evaporated</w:t>
+            </w:r>
+            <w:r>
+              <w:rPr>
+                <w:rFonts w:ascii="Arial" w:cs="Arial" w:eastAsia="Arial" w:hAnsi="Arial"/>
+                <w:sz w:val="19"/>
+                <w:szCs w:val="19"/>
+              </w:rPr>
+              <w:t xml:space="preserve"> is natural in both languages.</w:t>
             </w:r>
           </w:p>
         </w:tc>
@@ -10301,7 +10511,25 @@
                 <w:sz w:val="19"/>
                 <w:szCs w:val="19"/>
               </w:rPr>
-              <w:t xml:space="preserve">The hypothetical snake example contradicts step 1, where the same image is shared; _raise eyebrows_ also means surprise with mild disapproval, which </w:t>
+              <w:t xml:space="preserve">The hypothetical snake example contradicts step 1, where the same image is shared; </w:t>
+            </w:r>
+            <w:r>
+              <w:rPr>
+                <w:rFonts w:ascii="Arial" w:cs="Arial" w:eastAsia="Arial" w:hAnsi="Arial"/>
+                <w:i/>
+                <w:iCs/>
+                <w:sz w:val="19"/>
+                <w:szCs w:val="19"/>
+              </w:rPr>
+              <w:t xml:space="preserve">raise eyebrows</w:t>
+            </w:r>
+            <w:r>
+              <w:rPr>
+                <w:rFonts w:ascii="Arial" w:cs="Arial" w:eastAsia="Arial" w:hAnsi="Arial"/>
+                <w:sz w:val="19"/>
+                <w:szCs w:val="19"/>
+              </w:rPr>
+              <w:t xml:space="preserve"> also means surprise with mild disapproval, which </w:t>
             </w:r>
             <w:r>
               <w:rPr>
@@ -10611,7 +10839,25 @@
                 <w:sz w:val="19"/>
                 <w:szCs w:val="19"/>
               </w:rPr>
-              <w:t xml:space="preserve"> is the established Arabic term for Vinay and Darbelnet's _modulation_; </w:t>
+              <w:t xml:space="preserve"> is the established Arabic term for Vinay and Darbelnet's </w:t>
+            </w:r>
+            <w:r>
+              <w:rPr>
+                <w:rFonts w:ascii="Arial" w:cs="Arial" w:eastAsia="Arial" w:hAnsi="Arial"/>
+                <w:i/>
+                <w:iCs/>
+                <w:sz w:val="19"/>
+                <w:szCs w:val="19"/>
+              </w:rPr>
+              <w:t xml:space="preserve">modulation</w:t>
+            </w:r>
+            <w:r>
+              <w:rPr>
+                <w:rFonts w:ascii="Arial" w:cs="Arial" w:eastAsia="Arial" w:hAnsi="Arial"/>
+                <w:sz w:val="19"/>
+                <w:szCs w:val="19"/>
+              </w:rPr>
+              <w:t xml:space="preserve">; </w:t>
             </w:r>
             <w:r>
               <w:rPr>
@@ -10878,7 +11124,25 @@
                 <w:sz w:val="19"/>
                 <w:szCs w:val="19"/>
               </w:rPr>
-              <w:t xml:space="preserve">The only glossary definition of _Equivalence_ is Chapter 9's general 'match between expressions', which does not fit procedure 6; Adaptation already has a separate '(procedure)' entry, so Equivalence needs one too.</w:t>
+              <w:t xml:space="preserve">The only glossary definition of </w:t>
+            </w:r>
+            <w:r>
+              <w:rPr>
+                <w:rFonts w:ascii="Arial" w:cs="Arial" w:eastAsia="Arial" w:hAnsi="Arial"/>
+                <w:i/>
+                <w:iCs/>
+                <w:sz w:val="19"/>
+                <w:szCs w:val="19"/>
+              </w:rPr>
+              <w:t xml:space="preserve">Equivalence</w:t>
+            </w:r>
+            <w:r>
+              <w:rPr>
+                <w:rFonts w:ascii="Arial" w:cs="Arial" w:eastAsia="Arial" w:hAnsi="Arial"/>
+                <w:sz w:val="19"/>
+                <w:szCs w:val="19"/>
+              </w:rPr>
+              <w:t xml:space="preserve"> is Chapter 9's general 'match between expressions', which does not fit procedure 6; Adaptation already has a separate '(procedure)' entry, so Equivalence needs one too.</w:t>
             </w:r>
           </w:p>
         </w:tc>
@@ -11538,7 +11802,25 @@
                 <w:sz w:val="19"/>
                 <w:szCs w:val="19"/>
               </w:rPr>
-              <w:t xml:space="preserve"> is itself a literal translation of _key word_, so it cannot illustrate that 'literal translation often fails'; the definition also ignores the literal half of the label.</w:t>
+              <w:t xml:space="preserve"> is itself a literal translation of </w:t>
+            </w:r>
+            <w:r>
+              <w:rPr>
+                <w:rFonts w:ascii="Arial" w:cs="Arial" w:eastAsia="Arial" w:hAnsi="Arial"/>
+                <w:i/>
+                <w:iCs/>
+                <w:sz w:val="19"/>
+                <w:szCs w:val="19"/>
+              </w:rPr>
+              <w:t xml:space="preserve">key word</w:t>
+            </w:r>
+            <w:r>
+              <w:rPr>
+                <w:rFonts w:ascii="Arial" w:cs="Arial" w:eastAsia="Arial" w:hAnsi="Arial"/>
+                <w:sz w:val="19"/>
+                <w:szCs w:val="19"/>
+              </w:rPr>
+              <w:t xml:space="preserve">, so it cannot illustrate that 'literal translation often fails'; the definition also ignores the literal half of the label.</w:t>
             </w:r>
           </w:p>
         </w:tc>
@@ -11947,7 +12229,25 @@
                 <w:sz w:val="19"/>
                 <w:szCs w:val="19"/>
               </w:rPr>
-              <w:t xml:space="preserve"> = verbosity) is a sweeping, mildly pejorative generalisation, and the _Fed_ example shows reader knowledge, not Arabic verbosity.</w:t>
+              <w:t xml:space="preserve"> = verbosity) is a sweeping, mildly pejorative generalisation, and the </w:t>
+            </w:r>
+            <w:r>
+              <w:rPr>
+                <w:rFonts w:ascii="Arial" w:cs="Arial" w:eastAsia="Arial" w:hAnsi="Arial"/>
+                <w:i/>
+                <w:iCs/>
+                <w:sz w:val="19"/>
+                <w:szCs w:val="19"/>
+              </w:rPr>
+              <w:t xml:space="preserve">Fed</w:t>
+            </w:r>
+            <w:r>
+              <w:rPr>
+                <w:rFonts w:ascii="Arial" w:cs="Arial" w:eastAsia="Arial" w:hAnsi="Arial"/>
+                <w:sz w:val="19"/>
+                <w:szCs w:val="19"/>
+              </w:rPr>
+              <w:t xml:space="preserve"> example shows reader knowledge, not Arabic verbosity.</w:t>
             </w:r>
           </w:p>
         </w:tc>
@@ -12490,7 +12790,25 @@
                 <w:sz w:val="19"/>
                 <w:szCs w:val="19"/>
               </w:rPr>
-              <w:t xml:space="preserve"> has a ready English equivalent (_charity_) and needs no explanatory translation; the three words are religious terms, not technical ones.</w:t>
+              <w:t xml:space="preserve"> has a ready English equivalent (</w:t>
+            </w:r>
+            <w:r>
+              <w:rPr>
+                <w:rFonts w:ascii="Arial" w:cs="Arial" w:eastAsia="Arial" w:hAnsi="Arial"/>
+                <w:i/>
+                <w:iCs/>
+                <w:sz w:val="19"/>
+                <w:szCs w:val="19"/>
+              </w:rPr>
+              <w:t xml:space="preserve">charity</w:t>
+            </w:r>
+            <w:r>
+              <w:rPr>
+                <w:rFonts w:ascii="Arial" w:cs="Arial" w:eastAsia="Arial" w:hAnsi="Arial"/>
+                <w:sz w:val="19"/>
+                <w:szCs w:val="19"/>
+              </w:rPr>
+              <w:t xml:space="preserve">) and needs no explanatory translation; the three words are religious terms, not technical ones.</w:t>
             </w:r>
           </w:p>
         </w:tc>
@@ -14546,7 +14864,25 @@
                 <w:sz w:val="19"/>
                 <w:szCs w:val="19"/>
               </w:rPr>
-              <w:t xml:space="preserve">The steps present transliteration as obligatory, but descriptive translation is paraphrase and can stand alone, as the chapter’s own _sectioned_ example shows; “dense technical terms” is also unclear.</w:t>
+              <w:t xml:space="preserve">The steps present transliteration as obligatory, but descriptive translation is paraphrase and can stand alone, as the chapter’s own </w:t>
+            </w:r>
+            <w:r>
+              <w:rPr>
+                <w:rFonts w:ascii="Arial" w:cs="Arial" w:eastAsia="Arial" w:hAnsi="Arial"/>
+                <w:i/>
+                <w:iCs/>
+                <w:sz w:val="19"/>
+                <w:szCs w:val="19"/>
+              </w:rPr>
+              <w:t xml:space="preserve">sectioned</w:t>
+            </w:r>
+            <w:r>
+              <w:rPr>
+                <w:rFonts w:ascii="Arial" w:cs="Arial" w:eastAsia="Arial" w:hAnsi="Arial"/>
+                <w:sz w:val="19"/>
+                <w:szCs w:val="19"/>
+              </w:rPr>
+              <w:t xml:space="preserve"> example shows; “dense technical terms” is also unclear.</w:t>
             </w:r>
           </w:p>
         </w:tc>
@@ -15291,7 +15627,25 @@
                 <w:sz w:val="19"/>
                 <w:szCs w:val="19"/>
               </w:rPr>
-              <w:t xml:space="preserve"> for _blog_) is an existing Arabic word given a new sense, not a “completely new word”; neologisms standardly include new senses.</w:t>
+              <w:t xml:space="preserve"> for </w:t>
+            </w:r>
+            <w:r>
+              <w:rPr>
+                <w:rFonts w:ascii="Arial" w:cs="Arial" w:eastAsia="Arial" w:hAnsi="Arial"/>
+                <w:i/>
+                <w:iCs/>
+                <w:sz w:val="19"/>
+                <w:szCs w:val="19"/>
+              </w:rPr>
+              <w:t xml:space="preserve">blog</w:t>
+            </w:r>
+            <w:r>
+              <w:rPr>
+                <w:rFonts w:ascii="Arial" w:cs="Arial" w:eastAsia="Arial" w:hAnsi="Arial"/>
+                <w:sz w:val="19"/>
+                <w:szCs w:val="19"/>
+              </w:rPr>
+              <w:t xml:space="preserve">) is an existing Arabic word given a new sense, not a “completely new word”; neologisms standardly include new senses.</w:t>
             </w:r>
           </w:p>
         </w:tc>
@@ -15718,7 +16072,25 @@
                 <w:sz w:val="19"/>
                 <w:szCs w:val="19"/>
               </w:rPr>
-              <w:t xml:space="preserve"> (“the feast of love”) is not a loan translation of _Valentine’s Day_ (a calque would be </w:t>
+              <w:t xml:space="preserve"> (“the feast of love”) is not a loan translation of </w:t>
+            </w:r>
+            <w:r>
+              <w:rPr>
+                <w:rFonts w:ascii="Arial" w:cs="Arial" w:eastAsia="Arial" w:hAnsi="Arial"/>
+                <w:i/>
+                <w:iCs/>
+                <w:sz w:val="19"/>
+                <w:szCs w:val="19"/>
+              </w:rPr>
+              <w:t xml:space="preserve">Valentine’s Day</w:t>
+            </w:r>
+            <w:r>
+              <w:rPr>
+                <w:rFonts w:ascii="Arial" w:cs="Arial" w:eastAsia="Arial" w:hAnsi="Arial"/>
+                <w:sz w:val="19"/>
+                <w:szCs w:val="19"/>
+              </w:rPr>
+              <w:t xml:space="preserve"> (a calque would be </w:t>
             </w:r>
             <w:r>
               <w:rPr>
@@ -15860,7 +16232,43 @@
                 <w:sz w:val="19"/>
                 <w:szCs w:val="19"/>
               </w:rPr>
-              <w:t xml:space="preserve">The item promises “a short definition” but gives none for _waqf_ or _radio_, and it omits the standard Arabic term </w:t>
+              <w:t xml:space="preserve">The item promises “a short definition” but gives none for </w:t>
+            </w:r>
+            <w:r>
+              <w:rPr>
+                <w:rFonts w:ascii="Arial" w:cs="Arial" w:eastAsia="Arial" w:hAnsi="Arial"/>
+                <w:i/>
+                <w:iCs/>
+                <w:sz w:val="19"/>
+                <w:szCs w:val="19"/>
+              </w:rPr>
+              <w:t xml:space="preserve">waqf</w:t>
+            </w:r>
+            <w:r>
+              <w:rPr>
+                <w:rFonts w:ascii="Arial" w:cs="Arial" w:eastAsia="Arial" w:hAnsi="Arial"/>
+                <w:sz w:val="19"/>
+                <w:szCs w:val="19"/>
+              </w:rPr>
+              <w:t xml:space="preserve"> or </w:t>
+            </w:r>
+            <w:r>
+              <w:rPr>
+                <w:rFonts w:ascii="Arial" w:cs="Arial" w:eastAsia="Arial" w:hAnsi="Arial"/>
+                <w:i/>
+                <w:iCs/>
+                <w:sz w:val="19"/>
+                <w:szCs w:val="19"/>
+              </w:rPr>
+              <w:t xml:space="preserve">radio</w:t>
+            </w:r>
+            <w:r>
+              <w:rPr>
+                <w:rFonts w:ascii="Arial" w:cs="Arial" w:eastAsia="Arial" w:hAnsi="Arial"/>
+                <w:sz w:val="19"/>
+                <w:szCs w:val="19"/>
+              </w:rPr>
+              <w:t xml:space="preserve">, and it omits the standard Arabic term </w:t>
             </w:r>
             <w:r>
               <w:rPr>
@@ -17306,7 +17714,25 @@
                 <w:sz w:val="19"/>
                 <w:szCs w:val="19"/>
               </w:rPr>
-              <w:t xml:space="preserve">In the example, _shall be governed_ states a rule of legal effect rather than an obligation on a party, so “obligation” alone does not fit the example.</w:t>
+              <w:t xml:space="preserve">In the example, </w:t>
+            </w:r>
+            <w:r>
+              <w:rPr>
+                <w:rFonts w:ascii="Arial" w:cs="Arial" w:eastAsia="Arial" w:hAnsi="Arial"/>
+                <w:i/>
+                <w:iCs/>
+                <w:sz w:val="19"/>
+                <w:szCs w:val="19"/>
+              </w:rPr>
+              <w:t xml:space="preserve">shall be governed</w:t>
+            </w:r>
+            <w:r>
+              <w:rPr>
+                <w:rFonts w:ascii="Arial" w:cs="Arial" w:eastAsia="Arial" w:hAnsi="Arial"/>
+                <w:sz w:val="19"/>
+                <w:szCs w:val="19"/>
+              </w:rPr>
+              <w:t xml:space="preserve"> states a rule of legal effect rather than an obligation on a party, so “obligation” alone does not fit the example.</w:t>
             </w:r>
           </w:p>
         </w:tc>
@@ -18056,7 +18482,43 @@
                 <w:sz w:val="19"/>
                 <w:szCs w:val="19"/>
               </w:rPr>
-              <w:t xml:space="preserve">“Regime” is neutral in other senses (_tax regime_, _a training regime_), so the claim needs a context.</w:t>
+              <w:t xml:space="preserve">“Regime” is neutral in other senses (</w:t>
+            </w:r>
+            <w:r>
+              <w:rPr>
+                <w:rFonts w:ascii="Arial" w:cs="Arial" w:eastAsia="Arial" w:hAnsi="Arial"/>
+                <w:i/>
+                <w:iCs/>
+                <w:sz w:val="19"/>
+                <w:szCs w:val="19"/>
+              </w:rPr>
+              <w:t xml:space="preserve">tax regime</w:t>
+            </w:r>
+            <w:r>
+              <w:rPr>
+                <w:rFonts w:ascii="Arial" w:cs="Arial" w:eastAsia="Arial" w:hAnsi="Arial"/>
+                <w:sz w:val="19"/>
+                <w:szCs w:val="19"/>
+              </w:rPr>
+              <w:t xml:space="preserve">, </w:t>
+            </w:r>
+            <w:r>
+              <w:rPr>
+                <w:rFonts w:ascii="Arial" w:cs="Arial" w:eastAsia="Arial" w:hAnsi="Arial"/>
+                <w:i/>
+                <w:iCs/>
+                <w:sz w:val="19"/>
+                <w:szCs w:val="19"/>
+              </w:rPr>
+              <w:t xml:space="preserve">a training regime</w:t>
+            </w:r>
+            <w:r>
+              <w:rPr>
+                <w:rFonts w:ascii="Arial" w:cs="Arial" w:eastAsia="Arial" w:hAnsi="Arial"/>
+                <w:sz w:val="19"/>
+                <w:szCs w:val="19"/>
+              </w:rPr>
+              <w:t xml:space="preserve">), so the claim needs a context.</w:t>
             </w:r>
           </w:p>
         </w:tc>
@@ -18556,7 +19018,25 @@
                 <w:sz w:val="19"/>
                 <w:szCs w:val="19"/>
               </w:rPr>
-              <w:t xml:space="preserve">The cited work (Munir Baalbaki) is English–Arabic only; the Arabic–English _Al-Mawrid_ is by Rohi Baalbaki and is not in the References, so the item misattributes it.</w:t>
+              <w:t xml:space="preserve">The cited work (Munir Baalbaki) is English–Arabic only; the Arabic–English </w:t>
+            </w:r>
+            <w:r>
+              <w:rPr>
+                <w:rFonts w:ascii="Arial" w:cs="Arial" w:eastAsia="Arial" w:hAnsi="Arial"/>
+                <w:i/>
+                <w:iCs/>
+                <w:sz w:val="19"/>
+                <w:szCs w:val="19"/>
+              </w:rPr>
+              <w:t xml:space="preserve">Al-Mawrid</w:t>
+            </w:r>
+            <w:r>
+              <w:rPr>
+                <w:rFonts w:ascii="Arial" w:cs="Arial" w:eastAsia="Arial" w:hAnsi="Arial"/>
+                <w:sz w:val="19"/>
+                <w:szCs w:val="19"/>
+              </w:rPr>
+              <w:t xml:space="preserve"> is by Rohi Baalbaki and is not in the References, so the item misattributes it.</w:t>
             </w:r>
           </w:p>
         </w:tc>
@@ -18806,7 +19286,25 @@
                 <w:sz w:val="19"/>
                 <w:szCs w:val="19"/>
               </w:rPr>
-              <w:t xml:space="preserve">There are several Arabic language academies (Chapter 21 names three); _al-Muʿjam al-Wasīṭ_ is the Cairo academy’s, and “Arabic meanings” does not say it is monolingual (needed for step 2 of the three-check rule). The reference entry should also name Cairo.</w:t>
+              <w:t xml:space="preserve">There are several Arabic language academies (Chapter 21 names three); </w:t>
+            </w:r>
+            <w:r>
+              <w:rPr>
+                <w:rFonts w:ascii="Arial" w:cs="Arial" w:eastAsia="Arial" w:hAnsi="Arial"/>
+                <w:i/>
+                <w:iCs/>
+                <w:sz w:val="19"/>
+                <w:szCs w:val="19"/>
+              </w:rPr>
+              <w:t xml:space="preserve">al-Muʿjam al-Wasīṭ</w:t>
+            </w:r>
+            <w:r>
+              <w:rPr>
+                <w:rFonts w:ascii="Arial" w:cs="Arial" w:eastAsia="Arial" w:hAnsi="Arial"/>
+                <w:sz w:val="19"/>
+                <w:szCs w:val="19"/>
+              </w:rPr>
+              <w:t xml:space="preserve"> is the Cairo academy’s, and “Arabic meanings” does not say it is monolingual (needed for step 2 of the three-check rule). The reference entry should also name Cairo.</w:t>
             </w:r>
           </w:p>
         </w:tc>
@@ -26971,7 +27469,61 @@
                 <w:sz w:val="19"/>
                 <w:szCs w:val="19"/>
               </w:rPr>
-              <w:t xml:space="preserve">The example meant to show the meanings of _have_ contains the verb _takes_, not _have_, so it does not illustrate the point.</w:t>
+              <w:t xml:space="preserve">The example meant to show the meanings of </w:t>
+            </w:r>
+            <w:r>
+              <w:rPr>
+                <w:rFonts w:ascii="Arial" w:cs="Arial" w:eastAsia="Arial" w:hAnsi="Arial"/>
+                <w:i/>
+                <w:iCs/>
+                <w:sz w:val="19"/>
+                <w:szCs w:val="19"/>
+              </w:rPr>
+              <w:t xml:space="preserve">have</w:t>
+            </w:r>
+            <w:r>
+              <w:rPr>
+                <w:rFonts w:ascii="Arial" w:cs="Arial" w:eastAsia="Arial" w:hAnsi="Arial"/>
+                <w:sz w:val="19"/>
+                <w:szCs w:val="19"/>
+              </w:rPr>
+              <w:t xml:space="preserve"> contains the verb </w:t>
+            </w:r>
+            <w:r>
+              <w:rPr>
+                <w:rFonts w:ascii="Arial" w:cs="Arial" w:eastAsia="Arial" w:hAnsi="Arial"/>
+                <w:i/>
+                <w:iCs/>
+                <w:sz w:val="19"/>
+                <w:szCs w:val="19"/>
+              </w:rPr>
+              <w:t xml:space="preserve">takes</w:t>
+            </w:r>
+            <w:r>
+              <w:rPr>
+                <w:rFonts w:ascii="Arial" w:cs="Arial" w:eastAsia="Arial" w:hAnsi="Arial"/>
+                <w:sz w:val="19"/>
+                <w:szCs w:val="19"/>
+              </w:rPr>
+              <w:t xml:space="preserve">, not </w:t>
+            </w:r>
+            <w:r>
+              <w:rPr>
+                <w:rFonts w:ascii="Arial" w:cs="Arial" w:eastAsia="Arial" w:hAnsi="Arial"/>
+                <w:i/>
+                <w:iCs/>
+                <w:sz w:val="19"/>
+                <w:szCs w:val="19"/>
+              </w:rPr>
+              <w:t xml:space="preserve">have</w:t>
+            </w:r>
+            <w:r>
+              <w:rPr>
+                <w:rFonts w:ascii="Arial" w:cs="Arial" w:eastAsia="Arial" w:hAnsi="Arial"/>
+                <w:sz w:val="19"/>
+                <w:szCs w:val="19"/>
+              </w:rPr>
+              <w:t xml:space="preserve">, so it does not illustrate the point.</w:t>
             </w:r>
           </w:p>
         </w:tc>
@@ -27562,10 +28114,38 @@
             <w:r>
               <w:rPr>
                 <w:rFonts w:ascii="Arial" w:cs="Arial" w:eastAsia="Arial" w:hAnsi="Arial"/>
-                <w:sz w:val="19"/>
-                <w:szCs w:val="19"/>
-              </w:rPr>
-              <w:t xml:space="preserve">_Eventually_ and phrases such as _to see the Roman ruins_ are not ‘short words’, so ‘common’ describes the list accurately.</w:t>
+                <w:i/>
+                <w:iCs/>
+                <w:sz w:val="19"/>
+                <w:szCs w:val="19"/>
+              </w:rPr>
+              <w:t xml:space="preserve">Eventually</w:t>
+            </w:r>
+            <w:r>
+              <w:rPr>
+                <w:rFonts w:ascii="Arial" w:cs="Arial" w:eastAsia="Arial" w:hAnsi="Arial"/>
+                <w:sz w:val="19"/>
+                <w:szCs w:val="19"/>
+              </w:rPr>
+              <w:t xml:space="preserve"> and phrases such as </w:t>
+            </w:r>
+            <w:r>
+              <w:rPr>
+                <w:rFonts w:ascii="Arial" w:cs="Arial" w:eastAsia="Arial" w:hAnsi="Arial"/>
+                <w:i/>
+                <w:iCs/>
+                <w:sz w:val="19"/>
+                <w:szCs w:val="19"/>
+              </w:rPr>
+              <w:t xml:space="preserve">to see the Roman ruins</w:t>
+            </w:r>
+            <w:r>
+              <w:rPr>
+                <w:rFonts w:ascii="Arial" w:cs="Arial" w:eastAsia="Arial" w:hAnsi="Arial"/>
+                <w:sz w:val="19"/>
+                <w:szCs w:val="19"/>
+              </w:rPr>
+              <w:t xml:space="preserve"> are not ‘short words’, so ‘common’ describes the list accurately.</w:t>
             </w:r>
           </w:p>
         </w:tc>
@@ -28099,7 +28679,25 @@
                 <w:sz w:val="19"/>
                 <w:szCs w:val="19"/>
               </w:rPr>
-              <w:t xml:space="preserve"> as _very brave_ (an intensified single idea), not by keeping one of the two words.</w:t>
+              <w:t xml:space="preserve"> as </w:t>
+            </w:r>
+            <w:r>
+              <w:rPr>
+                <w:rFonts w:ascii="Arial" w:cs="Arial" w:eastAsia="Arial" w:hAnsi="Arial"/>
+                <w:i/>
+                <w:iCs/>
+                <w:sz w:val="19"/>
+                <w:szCs w:val="19"/>
+              </w:rPr>
+              <w:t xml:space="preserve">very brave</w:t>
+            </w:r>
+            <w:r>
+              <w:rPr>
+                <w:rFonts w:ascii="Arial" w:cs="Arial" w:eastAsia="Arial" w:hAnsi="Arial"/>
+                <w:sz w:val="19"/>
+                <w:szCs w:val="19"/>
+              </w:rPr>
+              <w:t xml:space="preserve"> (an intensified single idea), not by keeping one of the two words.</w:t>
             </w:r>
           </w:p>
         </w:tc>
@@ -29167,7 +29765,25 @@
                 <w:sz w:val="19"/>
                 <w:szCs w:val="19"/>
               </w:rPr>
-              <w:t xml:space="preserve">Many idioms allow some variation (_a real piece of cake_; Baker, 2018, speaks of little or no variation), so ‘usually’ is more accurate.</w:t>
+              <w:t xml:space="preserve">Many idioms allow some variation (</w:t>
+            </w:r>
+            <w:r>
+              <w:rPr>
+                <w:rFonts w:ascii="Arial" w:cs="Arial" w:eastAsia="Arial" w:hAnsi="Arial"/>
+                <w:i/>
+                <w:iCs/>
+                <w:sz w:val="19"/>
+                <w:szCs w:val="19"/>
+              </w:rPr>
+              <w:t xml:space="preserve">a real piece of cake</w:t>
+            </w:r>
+            <w:r>
+              <w:rPr>
+                <w:rFonts w:ascii="Arial" w:cs="Arial" w:eastAsia="Arial" w:hAnsi="Arial"/>
+                <w:sz w:val="19"/>
+                <w:szCs w:val="19"/>
+              </w:rPr>
+              <w:t xml:space="preserve">; Baker, 2018, speaks of little or no variation), so ‘usually’ is more accurate.</w:t>
             </w:r>
           </w:p>
         </w:tc>
@@ -29551,7 +30167,43 @@
                 <w:sz w:val="19"/>
                 <w:szCs w:val="19"/>
               </w:rPr>
-              <w:t xml:space="preserve"> means ‘get ready to work hard’, which matches _roll up one’s sleeves_, whereas _pull one’s socks up_ means ‘improve one’s effort or behaviour’ (settles the writers’ note).</w:t>
+              <w:t xml:space="preserve"> means ‘get ready to work hard’, which matches </w:t>
+            </w:r>
+            <w:r>
+              <w:rPr>
+                <w:rFonts w:ascii="Arial" w:cs="Arial" w:eastAsia="Arial" w:hAnsi="Arial"/>
+                <w:i/>
+                <w:iCs/>
+                <w:sz w:val="19"/>
+                <w:szCs w:val="19"/>
+              </w:rPr>
+              <w:t xml:space="preserve">roll up one’s sleeves</w:t>
+            </w:r>
+            <w:r>
+              <w:rPr>
+                <w:rFonts w:ascii="Arial" w:cs="Arial" w:eastAsia="Arial" w:hAnsi="Arial"/>
+                <w:sz w:val="19"/>
+                <w:szCs w:val="19"/>
+              </w:rPr>
+              <w:t xml:space="preserve">, whereas </w:t>
+            </w:r>
+            <w:r>
+              <w:rPr>
+                <w:rFonts w:ascii="Arial" w:cs="Arial" w:eastAsia="Arial" w:hAnsi="Arial"/>
+                <w:i/>
+                <w:iCs/>
+                <w:sz w:val="19"/>
+                <w:szCs w:val="19"/>
+              </w:rPr>
+              <w:t xml:space="preserve">pull one’s socks up</w:t>
+            </w:r>
+            <w:r>
+              <w:rPr>
+                <w:rFonts w:ascii="Arial" w:cs="Arial" w:eastAsia="Arial" w:hAnsi="Arial"/>
+                <w:sz w:val="19"/>
+                <w:szCs w:val="19"/>
+              </w:rPr>
+              <w:t xml:space="preserve"> means ‘improve one’s effort or behaviour’ (settles the writers’ note).</w:t>
             </w:r>
           </w:p>
         </w:tc>
@@ -31172,7 +31824,25 @@
                 <w:sz w:val="19"/>
                 <w:szCs w:val="19"/>
               </w:rPr>
-              <w:t xml:space="preserve">, which is not in _at the Sheraton_; the analysis should show it, and the added word is an addition, not part of the borrowing (settles the writer's note).</w:t>
+              <w:t xml:space="preserve">, which is not in </w:t>
+            </w:r>
+            <w:r>
+              <w:rPr>
+                <w:rFonts w:ascii="Arial" w:cs="Arial" w:eastAsia="Arial" w:hAnsi="Arial"/>
+                <w:i/>
+                <w:iCs/>
+                <w:sz w:val="19"/>
+                <w:szCs w:val="19"/>
+              </w:rPr>
+              <w:t xml:space="preserve">at the Sheraton</w:t>
+            </w:r>
+            <w:r>
+              <w:rPr>
+                <w:rFonts w:ascii="Arial" w:cs="Arial" w:eastAsia="Arial" w:hAnsi="Arial"/>
+                <w:sz w:val="19"/>
+                <w:szCs w:val="19"/>
+              </w:rPr>
+              <w:t xml:space="preserve">; the analysis should show it, and the added word is an addition, not part of the borrowing (settles the writer's note).</w:t>
             </w:r>
           </w:p>
         </w:tc>
@@ -31970,10 +32640,38 @@
             <w:r>
               <w:rPr>
                 <w:rFonts w:ascii="Arial" w:cs="Arial" w:eastAsia="Arial" w:hAnsi="Arial"/>
-                <w:sz w:val="19"/>
-                <w:szCs w:val="19"/>
-              </w:rPr>
-              <w:t xml:space="preserve">_algebra_ and _algorithm_ entered English through medieval Latin, not through a translator's loan-word-plus-explanation strategy, so 'this way' is factually wrong.</w:t>
+                <w:i/>
+                <w:iCs/>
+                <w:sz w:val="19"/>
+                <w:szCs w:val="19"/>
+              </w:rPr>
+              <w:t xml:space="preserve">algebra</w:t>
+            </w:r>
+            <w:r>
+              <w:rPr>
+                <w:rFonts w:ascii="Arial" w:cs="Arial" w:eastAsia="Arial" w:hAnsi="Arial"/>
+                <w:sz w:val="19"/>
+                <w:szCs w:val="19"/>
+              </w:rPr>
+              <w:t xml:space="preserve"> and </w:t>
+            </w:r>
+            <w:r>
+              <w:rPr>
+                <w:rFonts w:ascii="Arial" w:cs="Arial" w:eastAsia="Arial" w:hAnsi="Arial"/>
+                <w:i/>
+                <w:iCs/>
+                <w:sz w:val="19"/>
+                <w:szCs w:val="19"/>
+              </w:rPr>
+              <w:t xml:space="preserve">algorithm</w:t>
+            </w:r>
+            <w:r>
+              <w:rPr>
+                <w:rFonts w:ascii="Arial" w:cs="Arial" w:eastAsia="Arial" w:hAnsi="Arial"/>
+                <w:sz w:val="19"/>
+                <w:szCs w:val="19"/>
+              </w:rPr>
+              <w:t xml:space="preserve"> entered English through medieval Latin, not through a translator's loan-word-plus-explanation strategy, so 'this way' is factually wrong.</w:t>
             </w:r>
           </w:p>
         </w:tc>
@@ -40038,10 +40736,20 @@
             <w:r>
               <w:rPr>
                 <w:rFonts w:ascii="Arial" w:cs="Arial" w:eastAsia="Arial" w:hAnsi="Arial"/>
-                <w:sz w:val="19"/>
-                <w:szCs w:val="19"/>
-              </w:rPr>
-              <w:t xml:space="preserve">_not impossible_ is a hedge ('possible, though hard'); </w:t>
+                <w:i/>
+                <w:iCs/>
+                <w:sz w:val="19"/>
+                <w:szCs w:val="19"/>
+              </w:rPr>
+              <w:t xml:space="preserve">not impossible</w:t>
+            </w:r>
+            <w:r>
+              <w:rPr>
+                <w:rFonts w:ascii="Arial" w:cs="Arial" w:eastAsia="Arial" w:hAnsi="Arial"/>
+                <w:sz w:val="19"/>
+                <w:szCs w:val="19"/>
+              </w:rPr>
+              <w:t xml:space="preserve"> is a hedge ('possible, though hard'); </w:t>
             </w:r>
             <w:r>
               <w:rPr>
@@ -40205,7 +40913,25 @@
                 <w:sz w:val="19"/>
                 <w:szCs w:val="19"/>
               </w:rPr>
-              <w:t xml:space="preserve">The sentence implies that the academies, UNTERM or Arabterm record _cancel culture_ → </w:t>
+              <w:t xml:space="preserve">The sentence implies that the academies, UNTERM or Arabterm record </w:t>
+            </w:r>
+            <w:r>
+              <w:rPr>
+                <w:rFonts w:ascii="Arial" w:cs="Arial" w:eastAsia="Arial" w:hAnsi="Arial"/>
+                <w:i/>
+                <w:iCs/>
+                <w:sz w:val="19"/>
+                <w:szCs w:val="19"/>
+              </w:rPr>
+              <w:t xml:space="preserve">cancel culture</w:t>
+            </w:r>
+            <w:r>
+              <w:rPr>
+                <w:rFonts w:ascii="Arial" w:cs="Arial" w:eastAsia="Arial" w:hAnsi="Arial"/>
+                <w:sz w:val="19"/>
+                <w:szCs w:val="19"/>
+              </w:rPr>
+              <w:t xml:space="preserve"> → </w:t>
             </w:r>
             <w:r>
               <w:rPr>
@@ -41474,7 +42200,25 @@
                 <w:sz w:val="19"/>
                 <w:szCs w:val="19"/>
               </w:rPr>
-              <w:t xml:space="preserve">The 2nd edition names an editor (Colin McIntosh, with Ben Francis and Richard Poole), and APA 7 puts the editor first: McIntosh, C. (Ed.). (2009). _Oxford collocations dictionary for students of English_ (2nd ed.). Oxford University Press. The in-text form would change to McIntosh (2009)</w:t>
+              <w:t xml:space="preserve">The 2nd edition names an editor (Colin McIntosh, with Ben Francis and Richard Poole), and APA 7 puts the editor first: McIntosh, C. (Ed.). (2009). </w:t>
+            </w:r>
+            <w:r>
+              <w:rPr>
+                <w:rFonts w:ascii="Arial" w:cs="Arial" w:eastAsia="Arial" w:hAnsi="Arial"/>
+                <w:i/>
+                <w:iCs/>
+                <w:sz w:val="19"/>
+                <w:szCs w:val="19"/>
+              </w:rPr>
+              <w:t xml:space="preserve">Oxford collocations dictionary for students of English</w:t>
+            </w:r>
+            <w:r>
+              <w:rPr>
+                <w:rFonts w:ascii="Arial" w:cs="Arial" w:eastAsia="Arial" w:hAnsi="Arial"/>
+                <w:sz w:val="19"/>
+                <w:szCs w:val="19"/>
+              </w:rPr>
+              <w:t xml:space="preserve"> (2nd ed.). Oxford University Press. The in-text form would change to McIntosh (2009)</w:t>
             </w:r>
           </w:p>
         </w:tc>

</xml_diff>